<commit_message>
changes added in the pipelineeks file
</commit_message>
<xml_diff>
--- a/pipeline.docx
+++ b/pipeline.docx
@@ -13904,6 +13904,1516 @@
           <w:szCs w:val="16"/>
         </w:rPr>
         <w:t>git version 2.50.1</w:t>
+      </w:r>
+    </w:p>
+    <w:p>
+      <w:pPr>
+        <w:spacing w:after="0"/>
+        <w:rPr>
+          <w:sz w:val="16"/>
+          <w:szCs w:val="16"/>
+        </w:rPr>
+      </w:pPr>
+      <w:r>
+        <w:rPr>
+          <w:sz w:val="16"/>
+          <w:szCs w:val="16"/>
+        </w:rPr>
+        <w:t>[root@ip-172-31-22-19 ~]#</w:t>
+      </w:r>
+    </w:p>
+    <w:p>
+      <w:pPr>
+        <w:spacing w:after="0"/>
+        <w:rPr>
+          <w:sz w:val="16"/>
+          <w:szCs w:val="16"/>
+        </w:rPr>
+      </w:pPr>
+    </w:p>
+    <w:p>
+      <w:pPr>
+        <w:spacing w:after="0"/>
+        <w:rPr>
+          <w:sz w:val="16"/>
+          <w:szCs w:val="16"/>
+        </w:rPr>
+      </w:pPr>
+    </w:p>
+    <w:p>
+      <w:pPr>
+        <w:spacing w:after="0"/>
+        <w:rPr>
+          <w:sz w:val="16"/>
+          <w:szCs w:val="16"/>
+        </w:rPr>
+      </w:pPr>
+      <w:r>
+        <w:rPr>
+          <w:sz w:val="16"/>
+          <w:szCs w:val="16"/>
+        </w:rPr>
+        <w:t>Connecting the pods</w:t>
+      </w:r>
+    </w:p>
+    <w:p>
+      <w:pPr>
+        <w:spacing w:after="0"/>
+        <w:rPr>
+          <w:sz w:val="16"/>
+          <w:szCs w:val="16"/>
+        </w:rPr>
+      </w:pPr>
+    </w:p>
+    <w:p>
+      <w:pPr>
+        <w:spacing w:after="0"/>
+        <w:rPr>
+          <w:sz w:val="16"/>
+          <w:szCs w:val="16"/>
+        </w:rPr>
+      </w:pPr>
+    </w:p>
+    <w:p>
+      <w:pPr>
+        <w:spacing w:after="0"/>
+        <w:rPr>
+          <w:sz w:val="16"/>
+          <w:szCs w:val="16"/>
+        </w:rPr>
+      </w:pPr>
+      <w:r>
+        <w:rPr>
+          <w:sz w:val="16"/>
+          <w:szCs w:val="16"/>
+        </w:rPr>
+        <w:t>[root@ip-172-31-22-19 ~]# kubectl exec -it node-app-6c6897f77c-2mwvk -- /bin/sh</w:t>
+      </w:r>
+    </w:p>
+    <w:p>
+      <w:pPr>
+        <w:spacing w:after="0"/>
+        <w:rPr>
+          <w:sz w:val="16"/>
+          <w:szCs w:val="16"/>
+        </w:rPr>
+      </w:pPr>
+      <w:r>
+        <w:rPr>
+          <w:sz w:val="16"/>
+          <w:szCs w:val="16"/>
+        </w:rPr>
+        <w:t>/app # df -hT</w:t>
+      </w:r>
+    </w:p>
+    <w:p>
+      <w:pPr>
+        <w:spacing w:after="0"/>
+        <w:rPr>
+          <w:sz w:val="16"/>
+          <w:szCs w:val="16"/>
+        </w:rPr>
+      </w:pPr>
+      <w:r>
+        <w:rPr>
+          <w:sz w:val="16"/>
+          <w:szCs w:val="16"/>
+        </w:rPr>
+        <w:t>Filesystem           Type            Size      Used Available Use% Mounted on</w:t>
+      </w:r>
+    </w:p>
+    <w:p>
+      <w:pPr>
+        <w:spacing w:after="0"/>
+        <w:rPr>
+          <w:sz w:val="16"/>
+          <w:szCs w:val="16"/>
+        </w:rPr>
+      </w:pPr>
+      <w:r>
+        <w:rPr>
+          <w:sz w:val="16"/>
+          <w:szCs w:val="16"/>
+        </w:rPr>
+        <w:t>overlay              overlay        79.9G      3.9G     76.0G   5% /</w:t>
+      </w:r>
+    </w:p>
+    <w:p>
+      <w:pPr>
+        <w:spacing w:after="0"/>
+        <w:rPr>
+          <w:sz w:val="16"/>
+          <w:szCs w:val="16"/>
+        </w:rPr>
+      </w:pPr>
+      <w:r>
+        <w:rPr>
+          <w:sz w:val="16"/>
+          <w:szCs w:val="16"/>
+        </w:rPr>
+        <w:t>tmpfs                tmpfs          64.0M         0     64.0M   0% /dev</w:t>
+      </w:r>
+    </w:p>
+    <w:p>
+      <w:pPr>
+        <w:spacing w:after="0"/>
+        <w:rPr>
+          <w:sz w:val="16"/>
+          <w:szCs w:val="16"/>
+        </w:rPr>
+      </w:pPr>
+      <w:r>
+        <w:rPr>
+          <w:sz w:val="16"/>
+          <w:szCs w:val="16"/>
+        </w:rPr>
+        <w:t>/dev/nvme0n1p1       xfs            79.9G      3.9G     76.0G   5% /etc/hosts</w:t>
+      </w:r>
+    </w:p>
+    <w:p>
+      <w:pPr>
+        <w:spacing w:after="0"/>
+        <w:rPr>
+          <w:sz w:val="16"/>
+          <w:szCs w:val="16"/>
+        </w:rPr>
+      </w:pPr>
+      <w:r>
+        <w:rPr>
+          <w:sz w:val="16"/>
+          <w:szCs w:val="16"/>
+        </w:rPr>
+        <w:t>/dev/nvme0n1p1       xfs            79.9G      3.9G     76.0G   5% /dev/termination-log</w:t>
+      </w:r>
+    </w:p>
+    <w:p>
+      <w:pPr>
+        <w:spacing w:after="0"/>
+        <w:rPr>
+          <w:sz w:val="16"/>
+          <w:szCs w:val="16"/>
+        </w:rPr>
+      </w:pPr>
+      <w:r>
+        <w:rPr>
+          <w:sz w:val="16"/>
+          <w:szCs w:val="16"/>
+        </w:rPr>
+        <w:t>/dev/nvme0n1p1       xfs            79.9G      3.9G     76.0G   5% /etc/hostname</w:t>
+      </w:r>
+    </w:p>
+    <w:p>
+      <w:pPr>
+        <w:spacing w:after="0"/>
+        <w:rPr>
+          <w:sz w:val="16"/>
+          <w:szCs w:val="16"/>
+        </w:rPr>
+      </w:pPr>
+      <w:r>
+        <w:rPr>
+          <w:sz w:val="16"/>
+          <w:szCs w:val="16"/>
+        </w:rPr>
+        <w:t>/dev/nvme0n1p1       xfs            79.9G      3.9G     76.0G   5% /etc/resolv.conf</w:t>
+      </w:r>
+    </w:p>
+    <w:p>
+      <w:pPr>
+        <w:spacing w:after="0"/>
+        <w:rPr>
+          <w:sz w:val="16"/>
+          <w:szCs w:val="16"/>
+        </w:rPr>
+      </w:pPr>
+      <w:r>
+        <w:rPr>
+          <w:sz w:val="16"/>
+          <w:szCs w:val="16"/>
+        </w:rPr>
+        <w:t>shm                  tmpfs          64.0M         0     64.0M   0% /dev/shm</w:t>
+      </w:r>
+    </w:p>
+    <w:p>
+      <w:pPr>
+        <w:spacing w:after="0"/>
+        <w:rPr>
+          <w:sz w:val="16"/>
+          <w:szCs w:val="16"/>
+        </w:rPr>
+      </w:pPr>
+      <w:r>
+        <w:rPr>
+          <w:sz w:val="16"/>
+          <w:szCs w:val="16"/>
+        </w:rPr>
+        <w:t>tmpfs                tmpfs           3.2G     12.0K      3.2G   0% /run/secrets/kubernetes.io/serviceaccount</w:t>
+      </w:r>
+    </w:p>
+    <w:p>
+      <w:pPr>
+        <w:spacing w:after="0"/>
+        <w:rPr>
+          <w:sz w:val="16"/>
+          <w:szCs w:val="16"/>
+        </w:rPr>
+      </w:pPr>
+      <w:r>
+        <w:rPr>
+          <w:sz w:val="16"/>
+          <w:szCs w:val="16"/>
+        </w:rPr>
+        <w:t>tmpfs                tmpfs           1.9G         0      1.9G   0% /proc/acpi</w:t>
+      </w:r>
+    </w:p>
+    <w:p>
+      <w:pPr>
+        <w:spacing w:after="0"/>
+        <w:rPr>
+          <w:sz w:val="16"/>
+          <w:szCs w:val="16"/>
+        </w:rPr>
+      </w:pPr>
+      <w:r>
+        <w:rPr>
+          <w:sz w:val="16"/>
+          <w:szCs w:val="16"/>
+        </w:rPr>
+        <w:t>tmpfs                tmpfs          64.0M         0     64.0M   0% /proc/interrupts</w:t>
+      </w:r>
+    </w:p>
+    <w:p>
+      <w:pPr>
+        <w:spacing w:after="0"/>
+        <w:rPr>
+          <w:sz w:val="16"/>
+          <w:szCs w:val="16"/>
+        </w:rPr>
+      </w:pPr>
+      <w:r>
+        <w:rPr>
+          <w:sz w:val="16"/>
+          <w:szCs w:val="16"/>
+        </w:rPr>
+        <w:t>tmpfs                tmpfs          64.0M         0     64.0M   0% /proc/kcore</w:t>
+      </w:r>
+    </w:p>
+    <w:p>
+      <w:pPr>
+        <w:spacing w:after="0"/>
+        <w:rPr>
+          <w:sz w:val="16"/>
+          <w:szCs w:val="16"/>
+        </w:rPr>
+      </w:pPr>
+      <w:r>
+        <w:rPr>
+          <w:sz w:val="16"/>
+          <w:szCs w:val="16"/>
+        </w:rPr>
+        <w:t>tmpfs                tmpfs          64.0M         0     64.0M   0% /proc/keys</w:t>
+      </w:r>
+    </w:p>
+    <w:p>
+      <w:pPr>
+        <w:spacing w:after="0"/>
+        <w:rPr>
+          <w:sz w:val="16"/>
+          <w:szCs w:val="16"/>
+        </w:rPr>
+      </w:pPr>
+      <w:r>
+        <w:rPr>
+          <w:sz w:val="16"/>
+          <w:szCs w:val="16"/>
+        </w:rPr>
+        <w:t>tmpfs                tmpfs          64.0M         0     64.0M   0% /proc/latency_stats</w:t>
+      </w:r>
+    </w:p>
+    <w:p>
+      <w:pPr>
+        <w:spacing w:after="0"/>
+        <w:rPr>
+          <w:sz w:val="16"/>
+          <w:szCs w:val="16"/>
+        </w:rPr>
+      </w:pPr>
+      <w:r>
+        <w:rPr>
+          <w:sz w:val="16"/>
+          <w:szCs w:val="16"/>
+        </w:rPr>
+        <w:t>tmpfs                tmpfs          64.0M         0     64.0M   0% /proc/timer_list</w:t>
+      </w:r>
+    </w:p>
+    <w:p>
+      <w:pPr>
+        <w:spacing w:after="0"/>
+        <w:rPr>
+          <w:sz w:val="16"/>
+          <w:szCs w:val="16"/>
+        </w:rPr>
+      </w:pPr>
+      <w:r>
+        <w:rPr>
+          <w:sz w:val="16"/>
+          <w:szCs w:val="16"/>
+        </w:rPr>
+        <w:t>tmpfs                tmpfs           1.9G         0      1.9G   0% /sys/firmware</w:t>
+      </w:r>
+    </w:p>
+    <w:p>
+      <w:pPr>
+        <w:spacing w:after="0"/>
+        <w:rPr>
+          <w:sz w:val="16"/>
+          <w:szCs w:val="16"/>
+        </w:rPr>
+      </w:pPr>
+      <w:r>
+        <w:rPr>
+          <w:sz w:val="16"/>
+          <w:szCs w:val="16"/>
+        </w:rPr>
+        <w:t>/app #</w:t>
+      </w:r>
+    </w:p>
+    <w:p>
+      <w:pPr>
+        <w:spacing w:after="0"/>
+        <w:rPr>
+          <w:sz w:val="16"/>
+          <w:szCs w:val="16"/>
+        </w:rPr>
+      </w:pPr>
+      <w:r>
+        <w:rPr>
+          <w:sz w:val="16"/>
+          <w:szCs w:val="16"/>
+        </w:rPr>
+        <w:t>/app #</w:t>
+      </w:r>
+    </w:p>
+    <w:p>
+      <w:pPr>
+        <w:spacing w:after="0"/>
+        <w:rPr>
+          <w:sz w:val="16"/>
+          <w:szCs w:val="16"/>
+        </w:rPr>
+      </w:pPr>
+      <w:r>
+        <w:rPr>
+          <w:sz w:val="16"/>
+          <w:szCs w:val="16"/>
+        </w:rPr>
+        <w:t>/app # exit</w:t>
+      </w:r>
+    </w:p>
+    <w:p>
+      <w:pPr>
+        <w:spacing w:after="0"/>
+        <w:rPr>
+          <w:sz w:val="16"/>
+          <w:szCs w:val="16"/>
+        </w:rPr>
+      </w:pPr>
+      <w:r>
+        <w:rPr>
+          <w:sz w:val="16"/>
+          <w:szCs w:val="16"/>
+        </w:rPr>
+        <w:t>[root@ip-172-31-22-19 ~]# kubectl get pods</w:t>
+      </w:r>
+    </w:p>
+    <w:p>
+      <w:pPr>
+        <w:spacing w:after="0"/>
+        <w:rPr>
+          <w:sz w:val="16"/>
+          <w:szCs w:val="16"/>
+        </w:rPr>
+      </w:pPr>
+      <w:r>
+        <w:rPr>
+          <w:sz w:val="16"/>
+          <w:szCs w:val="16"/>
+        </w:rPr>
+        <w:t>NAME                        READY   STATUS    RESTARTS   AGE</w:t>
+      </w:r>
+    </w:p>
+    <w:p>
+      <w:pPr>
+        <w:spacing w:after="0"/>
+        <w:rPr>
+          <w:sz w:val="16"/>
+          <w:szCs w:val="16"/>
+        </w:rPr>
+      </w:pPr>
+      <w:r>
+        <w:rPr>
+          <w:sz w:val="16"/>
+          <w:szCs w:val="16"/>
+        </w:rPr>
+        <w:t>node-app-6c6897f77c-2mwvk   1/1     Running   0          44m</w:t>
+      </w:r>
+    </w:p>
+    <w:p>
+      <w:pPr>
+        <w:spacing w:after="0"/>
+        <w:rPr>
+          <w:sz w:val="16"/>
+          <w:szCs w:val="16"/>
+        </w:rPr>
+      </w:pPr>
+      <w:r>
+        <w:rPr>
+          <w:sz w:val="16"/>
+          <w:szCs w:val="16"/>
+        </w:rPr>
+        <w:t>node-app-6c6897f77c-652hp   1/1     Running   0          44m</w:t>
+      </w:r>
+    </w:p>
+    <w:p>
+      <w:pPr>
+        <w:spacing w:after="0"/>
+        <w:rPr>
+          <w:sz w:val="16"/>
+          <w:szCs w:val="16"/>
+        </w:rPr>
+      </w:pPr>
+      <w:r>
+        <w:rPr>
+          <w:sz w:val="16"/>
+          <w:szCs w:val="16"/>
+        </w:rPr>
+        <w:t>[root@ip-172-31-22-19 ~]# kubectl get nodes</w:t>
+      </w:r>
+    </w:p>
+    <w:p>
+      <w:pPr>
+        <w:spacing w:after="0"/>
+        <w:rPr>
+          <w:sz w:val="16"/>
+          <w:szCs w:val="16"/>
+        </w:rPr>
+      </w:pPr>
+      <w:r>
+        <w:rPr>
+          <w:sz w:val="16"/>
+          <w:szCs w:val="16"/>
+        </w:rPr>
+        <w:t>NAME                             STATUS   ROLES    AGE    VERSION</w:t>
+      </w:r>
+    </w:p>
+    <w:p>
+      <w:pPr>
+        <w:spacing w:after="0"/>
+        <w:rPr>
+          <w:sz w:val="16"/>
+          <w:szCs w:val="16"/>
+        </w:rPr>
+      </w:pPr>
+      <w:r>
+        <w:rPr>
+          <w:sz w:val="16"/>
+          <w:szCs w:val="16"/>
+        </w:rPr>
+        <w:t>ip-192-168-0-146.ec2.internal    Ready    &lt;none&gt;   146m   v1.34.4-eks-f69f56f</w:t>
+      </w:r>
+    </w:p>
+    <w:p>
+      <w:pPr>
+        <w:spacing w:after="0"/>
+        <w:rPr>
+          <w:sz w:val="16"/>
+          <w:szCs w:val="16"/>
+        </w:rPr>
+      </w:pPr>
+      <w:r>
+        <w:rPr>
+          <w:sz w:val="16"/>
+          <w:szCs w:val="16"/>
+        </w:rPr>
+        <w:t>ip-192-168-63-145.ec2.internal   Ready    &lt;none&gt;   146m   v1.34.4-eks-f69f56f</w:t>
+      </w:r>
+    </w:p>
+    <w:p>
+      <w:pPr>
+        <w:spacing w:after="0"/>
+        <w:rPr>
+          <w:sz w:val="16"/>
+          <w:szCs w:val="16"/>
+        </w:rPr>
+      </w:pPr>
+      <w:r>
+        <w:rPr>
+          <w:sz w:val="16"/>
+          <w:szCs w:val="16"/>
+        </w:rPr>
+        <w:t>[root@ip-172-31-22-19 ~]# kubectl get cluster</w:t>
+      </w:r>
+    </w:p>
+    <w:p>
+      <w:pPr>
+        <w:spacing w:after="0"/>
+        <w:rPr>
+          <w:sz w:val="16"/>
+          <w:szCs w:val="16"/>
+        </w:rPr>
+      </w:pPr>
+      <w:r>
+        <w:rPr>
+          <w:sz w:val="16"/>
+          <w:szCs w:val="16"/>
+        </w:rPr>
+        <w:t>error: the server doesn't have a resource type "cluster"</w:t>
+      </w:r>
+    </w:p>
+    <w:p>
+      <w:pPr>
+        <w:spacing w:after="0"/>
+        <w:rPr>
+          <w:sz w:val="16"/>
+          <w:szCs w:val="16"/>
+        </w:rPr>
+      </w:pPr>
+      <w:r>
+        <w:rPr>
+          <w:sz w:val="16"/>
+          <w:szCs w:val="16"/>
+        </w:rPr>
+        <w:t>[root@ip-172-31-22-19 ~]# eksctl get cluster</w:t>
+      </w:r>
+    </w:p>
+    <w:p>
+      <w:pPr>
+        <w:spacing w:after="0"/>
+        <w:rPr>
+          <w:sz w:val="16"/>
+          <w:szCs w:val="16"/>
+        </w:rPr>
+      </w:pPr>
+      <w:r>
+        <w:rPr>
+          <w:sz w:val="16"/>
+          <w:szCs w:val="16"/>
+        </w:rPr>
+        <w:t>NAME            REGION          EKSCTL CREATED</w:t>
+      </w:r>
+    </w:p>
+    <w:p>
+      <w:pPr>
+        <w:spacing w:after="0"/>
+        <w:rPr>
+          <w:sz w:val="16"/>
+          <w:szCs w:val="16"/>
+        </w:rPr>
+      </w:pPr>
+      <w:r>
+        <w:rPr>
+          <w:sz w:val="16"/>
+          <w:szCs w:val="16"/>
+        </w:rPr>
+        <w:t>my-eks-cluster  us-east-1       True</w:t>
+      </w:r>
+    </w:p>
+    <w:p>
+      <w:pPr>
+        <w:spacing w:after="0"/>
+        <w:rPr>
+          <w:sz w:val="16"/>
+          <w:szCs w:val="16"/>
+        </w:rPr>
+      </w:pPr>
+      <w:r>
+        <w:rPr>
+          <w:sz w:val="16"/>
+          <w:szCs w:val="16"/>
+        </w:rPr>
+        <w:t>[root@ip-172-31-22-19 ~]#</w:t>
+      </w:r>
+    </w:p>
+    <w:p>
+      <w:pPr>
+        <w:spacing w:after="0"/>
+        <w:rPr>
+          <w:sz w:val="16"/>
+          <w:szCs w:val="16"/>
+        </w:rPr>
+      </w:pPr>
+    </w:p>
+    <w:p>
+      <w:pPr>
+        <w:spacing w:after="0"/>
+        <w:rPr>
+          <w:sz w:val="16"/>
+          <w:szCs w:val="16"/>
+        </w:rPr>
+      </w:pPr>
+      <w:r>
+        <w:rPr>
+          <w:sz w:val="16"/>
+          <w:szCs w:val="16"/>
+        </w:rPr>
+        <w:t>History:</w:t>
+      </w:r>
+    </w:p>
+    <w:p>
+      <w:pPr>
+        <w:spacing w:after="0"/>
+        <w:rPr>
+          <w:sz w:val="16"/>
+          <w:szCs w:val="16"/>
+        </w:rPr>
+      </w:pPr>
+    </w:p>
+    <w:p>
+      <w:pPr>
+        <w:spacing w:after="0"/>
+        <w:rPr>
+          <w:sz w:val="16"/>
+          <w:szCs w:val="16"/>
+        </w:rPr>
+      </w:pPr>
+      <w:r>
+        <w:rPr>
+          <w:sz w:val="16"/>
+          <w:szCs w:val="16"/>
+        </w:rPr>
+        <w:t>[root@ip-172-31-22-19 ~]# history</w:t>
+      </w:r>
+    </w:p>
+    <w:p>
+      <w:pPr>
+        <w:spacing w:after="0"/>
+        <w:rPr>
+          <w:sz w:val="16"/>
+          <w:szCs w:val="16"/>
+        </w:rPr>
+      </w:pPr>
+      <w:r>
+        <w:rPr>
+          <w:sz w:val="16"/>
+          <w:szCs w:val="16"/>
+        </w:rPr>
+        <w:t xml:space="preserve">    1  dnf update -y</w:t>
+      </w:r>
+    </w:p>
+    <w:p>
+      <w:pPr>
+        <w:spacing w:after="0"/>
+        <w:rPr>
+          <w:sz w:val="16"/>
+          <w:szCs w:val="16"/>
+        </w:rPr>
+      </w:pPr>
+      <w:r>
+        <w:rPr>
+          <w:sz w:val="16"/>
+          <w:szCs w:val="16"/>
+        </w:rPr>
+        <w:t xml:space="preserve">    2  sudo dnf install java-17-amazon-corretto -y</w:t>
+      </w:r>
+    </w:p>
+    <w:p>
+      <w:pPr>
+        <w:spacing w:after="0"/>
+        <w:rPr>
+          <w:sz w:val="16"/>
+          <w:szCs w:val="16"/>
+        </w:rPr>
+      </w:pPr>
+      <w:r>
+        <w:rPr>
+          <w:sz w:val="16"/>
+          <w:szCs w:val="16"/>
+        </w:rPr>
+        <w:t xml:space="preserve">    3  wget -O /etc/yum.repos.d/jenkins.repo https://pkg.jenkins.io/redhat-stable/jenkins.repo</w:t>
+      </w:r>
+    </w:p>
+    <w:p>
+      <w:pPr>
+        <w:spacing w:after="0"/>
+        <w:rPr>
+          <w:sz w:val="16"/>
+          <w:szCs w:val="16"/>
+        </w:rPr>
+      </w:pPr>
+      <w:r>
+        <w:rPr>
+          <w:sz w:val="16"/>
+          <w:szCs w:val="16"/>
+        </w:rPr>
+        <w:t xml:space="preserve">    4  ~]# wget -O /etc/yum.repos.d/jenkins.repo https://pkg.jenkins.io/redhat-stable/jenkins.repo</w:t>
+      </w:r>
+    </w:p>
+    <w:p>
+      <w:pPr>
+        <w:spacing w:after="0"/>
+        <w:rPr>
+          <w:sz w:val="16"/>
+          <w:szCs w:val="16"/>
+        </w:rPr>
+      </w:pPr>
+      <w:r>
+        <w:rPr>
+          <w:sz w:val="16"/>
+          <w:szCs w:val="16"/>
+        </w:rPr>
+        <w:t xml:space="preserve">    5  wget -O /etc/yum.repos.d/jenkins.repo https://pkg.jenkins.io/redhat-stable/jenkins.repo</w:t>
+      </w:r>
+    </w:p>
+    <w:p>
+      <w:pPr>
+        <w:spacing w:after="0"/>
+        <w:rPr>
+          <w:sz w:val="16"/>
+          <w:szCs w:val="16"/>
+        </w:rPr>
+      </w:pPr>
+      <w:r>
+        <w:rPr>
+          <w:sz w:val="16"/>
+          <w:szCs w:val="16"/>
+        </w:rPr>
+        <w:t xml:space="preserve">    6  sudo rpm --import https://pkg.jenkins.io/redhat-stable/jenkins.io-2023.key</w:t>
+      </w:r>
+    </w:p>
+    <w:p>
+      <w:pPr>
+        <w:spacing w:after="0"/>
+        <w:rPr>
+          <w:sz w:val="16"/>
+          <w:szCs w:val="16"/>
+        </w:rPr>
+      </w:pPr>
+      <w:r>
+        <w:rPr>
+          <w:sz w:val="16"/>
+          <w:szCs w:val="16"/>
+        </w:rPr>
+        <w:t xml:space="preserve">    7  sudo yum install jenkins -y</w:t>
+      </w:r>
+    </w:p>
+    <w:p>
+      <w:pPr>
+        <w:spacing w:after="0"/>
+        <w:rPr>
+          <w:sz w:val="16"/>
+          <w:szCs w:val="16"/>
+        </w:rPr>
+      </w:pPr>
+      <w:r>
+        <w:rPr>
+          <w:sz w:val="16"/>
+          <w:szCs w:val="16"/>
+        </w:rPr>
+        <w:t xml:space="preserve">    8  systemctl start jenkins</w:t>
+      </w:r>
+    </w:p>
+    <w:p>
+      <w:pPr>
+        <w:spacing w:after="0"/>
+        <w:rPr>
+          <w:sz w:val="16"/>
+          <w:szCs w:val="16"/>
+        </w:rPr>
+      </w:pPr>
+      <w:r>
+        <w:rPr>
+          <w:sz w:val="16"/>
+          <w:szCs w:val="16"/>
+        </w:rPr>
+        <w:t xml:space="preserve">    9  systemctl enable jenkins</w:t>
+      </w:r>
+    </w:p>
+    <w:p>
+      <w:pPr>
+        <w:spacing w:after="0"/>
+        <w:rPr>
+          <w:sz w:val="16"/>
+          <w:szCs w:val="16"/>
+        </w:rPr>
+      </w:pPr>
+      <w:r>
+        <w:rPr>
+          <w:sz w:val="16"/>
+          <w:szCs w:val="16"/>
+        </w:rPr>
+        <w:t xml:space="preserve">   10  systemctl status jenkins</w:t>
+      </w:r>
+    </w:p>
+    <w:p>
+      <w:pPr>
+        <w:spacing w:after="0"/>
+        <w:rPr>
+          <w:sz w:val="16"/>
+          <w:szCs w:val="16"/>
+        </w:rPr>
+      </w:pPr>
+      <w:r>
+        <w:rPr>
+          <w:sz w:val="16"/>
+          <w:szCs w:val="16"/>
+        </w:rPr>
+        <w:t xml:space="preserve">   11  cat /var/lib/jenkins/secrets/initialAdminPassword</w:t>
+      </w:r>
+    </w:p>
+    <w:p>
+      <w:pPr>
+        <w:spacing w:after="0"/>
+        <w:rPr>
+          <w:sz w:val="16"/>
+          <w:szCs w:val="16"/>
+        </w:rPr>
+      </w:pPr>
+      <w:r>
+        <w:rPr>
+          <w:sz w:val="16"/>
+          <w:szCs w:val="16"/>
+        </w:rPr>
+        <w:t xml:space="preserve">   12  dnf install docker -y</w:t>
+      </w:r>
+    </w:p>
+    <w:p>
+      <w:pPr>
+        <w:spacing w:after="0"/>
+        <w:rPr>
+          <w:sz w:val="16"/>
+          <w:szCs w:val="16"/>
+        </w:rPr>
+      </w:pPr>
+      <w:r>
+        <w:rPr>
+          <w:sz w:val="16"/>
+          <w:szCs w:val="16"/>
+        </w:rPr>
+        <w:t xml:space="preserve">   13  systemctl status docker</w:t>
+      </w:r>
+    </w:p>
+    <w:p>
+      <w:pPr>
+        <w:spacing w:after="0"/>
+        <w:rPr>
+          <w:sz w:val="16"/>
+          <w:szCs w:val="16"/>
+        </w:rPr>
+      </w:pPr>
+      <w:r>
+        <w:rPr>
+          <w:sz w:val="16"/>
+          <w:szCs w:val="16"/>
+        </w:rPr>
+        <w:t xml:space="preserve">   14  systemctl start docker</w:t>
+      </w:r>
+    </w:p>
+    <w:p>
+      <w:pPr>
+        <w:spacing w:after="0"/>
+        <w:rPr>
+          <w:sz w:val="16"/>
+          <w:szCs w:val="16"/>
+        </w:rPr>
+      </w:pPr>
+      <w:r>
+        <w:rPr>
+          <w:sz w:val="16"/>
+          <w:szCs w:val="16"/>
+        </w:rPr>
+        <w:t xml:space="preserve">   15  systemctl enable docker</w:t>
+      </w:r>
+    </w:p>
+    <w:p>
+      <w:pPr>
+        <w:spacing w:after="0"/>
+        <w:rPr>
+          <w:sz w:val="16"/>
+          <w:szCs w:val="16"/>
+        </w:rPr>
+      </w:pPr>
+      <w:r>
+        <w:rPr>
+          <w:sz w:val="16"/>
+          <w:szCs w:val="16"/>
+        </w:rPr>
+        <w:t xml:space="preserve">   16  systemctl status docker</w:t>
+      </w:r>
+    </w:p>
+    <w:p>
+      <w:pPr>
+        <w:spacing w:after="0"/>
+        <w:rPr>
+          <w:sz w:val="16"/>
+          <w:szCs w:val="16"/>
+        </w:rPr>
+      </w:pPr>
+      <w:r>
+        <w:rPr>
+          <w:sz w:val="16"/>
+          <w:szCs w:val="16"/>
+        </w:rPr>
+        <w:t xml:space="preserve">   17  sudo usermod -aG docker jenkins</w:t>
+      </w:r>
+    </w:p>
+    <w:p>
+      <w:pPr>
+        <w:spacing w:after="0"/>
+        <w:rPr>
+          <w:sz w:val="16"/>
+          <w:szCs w:val="16"/>
+        </w:rPr>
+      </w:pPr>
+      <w:r>
+        <w:rPr>
+          <w:sz w:val="16"/>
+          <w:szCs w:val="16"/>
+        </w:rPr>
+        <w:t xml:space="preserve">   18  dnf install git -y</w:t>
+      </w:r>
+    </w:p>
+    <w:p>
+      <w:pPr>
+        <w:spacing w:after="0"/>
+        <w:rPr>
+          <w:sz w:val="16"/>
+          <w:szCs w:val="16"/>
+        </w:rPr>
+      </w:pPr>
+      <w:r>
+        <w:rPr>
+          <w:sz w:val="16"/>
+          <w:szCs w:val="16"/>
+        </w:rPr>
+        <w:t xml:space="preserve">   19  systemctl status git</w:t>
+      </w:r>
+    </w:p>
+    <w:p>
+      <w:pPr>
+        <w:spacing w:after="0"/>
+        <w:rPr>
+          <w:sz w:val="16"/>
+          <w:szCs w:val="16"/>
+        </w:rPr>
+      </w:pPr>
+      <w:r>
+        <w:rPr>
+          <w:sz w:val="16"/>
+          <w:szCs w:val="16"/>
+        </w:rPr>
+        <w:t xml:space="preserve">   20  systemctl start git</w:t>
+      </w:r>
+    </w:p>
+    <w:p>
+      <w:pPr>
+        <w:spacing w:after="0"/>
+        <w:rPr>
+          <w:sz w:val="16"/>
+          <w:szCs w:val="16"/>
+        </w:rPr>
+      </w:pPr>
+      <w:r>
+        <w:rPr>
+          <w:sz w:val="16"/>
+          <w:szCs w:val="16"/>
+        </w:rPr>
+        <w:t xml:space="preserve">   21  git clone https://github.com/ramarajanjp/devops2.git</w:t>
+      </w:r>
+    </w:p>
+    <w:p>
+      <w:pPr>
+        <w:spacing w:after="0"/>
+        <w:rPr>
+          <w:sz w:val="16"/>
+          <w:szCs w:val="16"/>
+        </w:rPr>
+      </w:pPr>
+      <w:r>
+        <w:rPr>
+          <w:sz w:val="16"/>
+          <w:szCs w:val="16"/>
+        </w:rPr>
+        <w:t xml:space="preserve">   22  cd devops2/</w:t>
+      </w:r>
+    </w:p>
+    <w:p>
+      <w:pPr>
+        <w:spacing w:after="0"/>
+        <w:rPr>
+          <w:sz w:val="16"/>
+          <w:szCs w:val="16"/>
+        </w:rPr>
+      </w:pPr>
+      <w:r>
+        <w:rPr>
+          <w:sz w:val="16"/>
+          <w:szCs w:val="16"/>
+        </w:rPr>
+        <w:t xml:space="preserve">   23  ls</w:t>
+      </w:r>
+    </w:p>
+    <w:p>
+      <w:pPr>
+        <w:spacing w:after="0"/>
+        <w:rPr>
+          <w:sz w:val="16"/>
+          <w:szCs w:val="16"/>
+        </w:rPr>
+      </w:pPr>
+      <w:r>
+        <w:rPr>
+          <w:sz w:val="16"/>
+          <w:szCs w:val="16"/>
+        </w:rPr>
+        <w:t xml:space="preserve">   24  dnf install awscli -y</w:t>
+      </w:r>
+    </w:p>
+    <w:p>
+      <w:pPr>
+        <w:spacing w:after="0"/>
+        <w:rPr>
+          <w:sz w:val="16"/>
+          <w:szCs w:val="16"/>
+        </w:rPr>
+      </w:pPr>
+      <w:r>
+        <w:rPr>
+          <w:sz w:val="16"/>
+          <w:szCs w:val="16"/>
+        </w:rPr>
+        <w:t xml:space="preserve">   25  aws configure</w:t>
+      </w:r>
+    </w:p>
+    <w:p>
+      <w:pPr>
+        <w:spacing w:after="0"/>
+        <w:rPr>
+          <w:sz w:val="16"/>
+          <w:szCs w:val="16"/>
+        </w:rPr>
+      </w:pPr>
+      <w:r>
+        <w:rPr>
+          <w:sz w:val="16"/>
+          <w:szCs w:val="16"/>
+        </w:rPr>
+        <w:t xml:space="preserve">   26  cd devops2</w:t>
+      </w:r>
+    </w:p>
+    <w:p>
+      <w:pPr>
+        <w:spacing w:after="0"/>
+        <w:rPr>
+          <w:sz w:val="16"/>
+          <w:szCs w:val="16"/>
+        </w:rPr>
+      </w:pPr>
+      <w:r>
+        <w:rPr>
+          <w:sz w:val="16"/>
+          <w:szCs w:val="16"/>
+        </w:rPr>
+        <w:t xml:space="preserve">   27  ls</w:t>
+      </w:r>
+    </w:p>
+    <w:p>
+      <w:pPr>
+        <w:spacing w:after="0"/>
+        <w:rPr>
+          <w:sz w:val="16"/>
+          <w:szCs w:val="16"/>
+        </w:rPr>
+      </w:pPr>
+      <w:r>
+        <w:rPr>
+          <w:sz w:val="16"/>
+          <w:szCs w:val="16"/>
+        </w:rPr>
+        <w:t xml:space="preserve">   28  cat jenkin-pipeline\ -\ worked</w:t>
+      </w:r>
+    </w:p>
+    <w:p>
+      <w:pPr>
+        <w:spacing w:after="0"/>
+        <w:rPr>
+          <w:sz w:val="16"/>
+          <w:szCs w:val="16"/>
+        </w:rPr>
+      </w:pPr>
+      <w:r>
+        <w:rPr>
+          <w:sz w:val="16"/>
+          <w:szCs w:val="16"/>
+        </w:rPr>
+        <w:t xml:space="preserve">   29  cat Jenkinsfile</w:t>
+      </w:r>
+    </w:p>
+    <w:p>
+      <w:pPr>
+        <w:spacing w:after="0"/>
+        <w:rPr>
+          <w:sz w:val="16"/>
+          <w:szCs w:val="16"/>
+        </w:rPr>
+      </w:pPr>
+      <w:r>
+        <w:rPr>
+          <w:sz w:val="16"/>
+          <w:szCs w:val="16"/>
+        </w:rPr>
+        <w:t xml:space="preserve">   30  docker ps</w:t>
+      </w:r>
+    </w:p>
+    <w:p>
+      <w:pPr>
+        <w:spacing w:after="0"/>
+        <w:rPr>
+          <w:sz w:val="16"/>
+          <w:szCs w:val="16"/>
+        </w:rPr>
+      </w:pPr>
+      <w:r>
+        <w:rPr>
+          <w:sz w:val="16"/>
+          <w:szCs w:val="16"/>
+        </w:rPr>
+        <w:t xml:space="preserve">   31  kubectl get deployments</w:t>
+      </w:r>
+    </w:p>
+    <w:p>
+      <w:pPr>
+        <w:spacing w:after="0"/>
+        <w:rPr>
+          <w:sz w:val="16"/>
+          <w:szCs w:val="16"/>
+        </w:rPr>
+      </w:pPr>
+      <w:r>
+        <w:rPr>
+          <w:sz w:val="16"/>
+          <w:szCs w:val="16"/>
+        </w:rPr>
+        <w:t xml:space="preserve">   32  aws configure</w:t>
+      </w:r>
+    </w:p>
+    <w:p>
+      <w:pPr>
+        <w:spacing w:after="0"/>
+        <w:rPr>
+          <w:sz w:val="16"/>
+          <w:szCs w:val="16"/>
+        </w:rPr>
+      </w:pPr>
+      <w:r>
+        <w:rPr>
+          <w:sz w:val="16"/>
+          <w:szCs w:val="16"/>
+        </w:rPr>
+        <w:t xml:space="preserve">   33  kubectl</w:t>
+      </w:r>
+    </w:p>
+    <w:p>
+      <w:pPr>
+        <w:spacing w:after="0"/>
+        <w:rPr>
+          <w:sz w:val="16"/>
+          <w:szCs w:val="16"/>
+        </w:rPr>
+      </w:pPr>
+      <w:r>
+        <w:rPr>
+          <w:sz w:val="16"/>
+          <w:szCs w:val="16"/>
+        </w:rPr>
+        <w:t xml:space="preserve">   34  kubectl get deployment</w:t>
+      </w:r>
+    </w:p>
+    <w:p>
+      <w:pPr>
+        <w:spacing w:after="0"/>
+        <w:rPr>
+          <w:sz w:val="16"/>
+          <w:szCs w:val="16"/>
+        </w:rPr>
+      </w:pPr>
+      <w:r>
+        <w:rPr>
+          <w:sz w:val="16"/>
+          <w:szCs w:val="16"/>
+        </w:rPr>
+        <w:t xml:space="preserve">   35  kubectl</w:t>
+      </w:r>
+    </w:p>
+    <w:p>
+      <w:pPr>
+        <w:spacing w:after="0"/>
+        <w:rPr>
+          <w:sz w:val="16"/>
+          <w:szCs w:val="16"/>
+        </w:rPr>
+      </w:pPr>
+      <w:r>
+        <w:rPr>
+          <w:sz w:val="16"/>
+          <w:szCs w:val="16"/>
+        </w:rPr>
+        <w:t xml:space="preserve">   36  kubectl exec -it node-app-6c6897f77c-2mwvk -- /bin/bash</w:t>
+      </w:r>
+    </w:p>
+    <w:p>
+      <w:pPr>
+        <w:spacing w:after="0"/>
+        <w:rPr>
+          <w:sz w:val="16"/>
+          <w:szCs w:val="16"/>
+        </w:rPr>
+      </w:pPr>
+      <w:r>
+        <w:rPr>
+          <w:sz w:val="16"/>
+          <w:szCs w:val="16"/>
+        </w:rPr>
+        <w:t xml:space="preserve">   37  kubectl get nodes</w:t>
+      </w:r>
+    </w:p>
+    <w:p>
+      <w:pPr>
+        <w:spacing w:after="0"/>
+        <w:rPr>
+          <w:sz w:val="16"/>
+          <w:szCs w:val="16"/>
+        </w:rPr>
+      </w:pPr>
+      <w:r>
+        <w:rPr>
+          <w:sz w:val="16"/>
+          <w:szCs w:val="16"/>
+        </w:rPr>
+        <w:t xml:space="preserve">   38  eksctl</w:t>
+      </w:r>
+    </w:p>
+    <w:p>
+      <w:pPr>
+        <w:spacing w:after="0"/>
+        <w:rPr>
+          <w:sz w:val="16"/>
+          <w:szCs w:val="16"/>
+        </w:rPr>
+      </w:pPr>
+      <w:r>
+        <w:rPr>
+          <w:sz w:val="16"/>
+          <w:szCs w:val="16"/>
+        </w:rPr>
+        <w:t xml:space="preserve">   39  eksctl get --help</w:t>
+      </w:r>
+    </w:p>
+    <w:p>
+      <w:pPr>
+        <w:spacing w:after="0"/>
+        <w:rPr>
+          <w:sz w:val="16"/>
+          <w:szCs w:val="16"/>
+        </w:rPr>
+      </w:pPr>
+      <w:r>
+        <w:rPr>
+          <w:sz w:val="16"/>
+          <w:szCs w:val="16"/>
+        </w:rPr>
+        <w:t xml:space="preserve">   40  eksctl get cluster</w:t>
+      </w:r>
+    </w:p>
+    <w:p>
+      <w:pPr>
+        <w:spacing w:after="0"/>
+        <w:rPr>
+          <w:sz w:val="16"/>
+          <w:szCs w:val="16"/>
+        </w:rPr>
+      </w:pPr>
+      <w:r>
+        <w:rPr>
+          <w:sz w:val="16"/>
+          <w:szCs w:val="16"/>
+        </w:rPr>
+        <w:t xml:space="preserve">   41  kubectl get pods</w:t>
+      </w:r>
+    </w:p>
+    <w:p>
+      <w:pPr>
+        <w:spacing w:after="0"/>
+        <w:rPr>
+          <w:sz w:val="16"/>
+          <w:szCs w:val="16"/>
+        </w:rPr>
+      </w:pPr>
+      <w:r>
+        <w:rPr>
+          <w:sz w:val="16"/>
+          <w:szCs w:val="16"/>
+        </w:rPr>
+        <w:t xml:space="preserve">   42  aws sts get-caller-identity</w:t>
+      </w:r>
+    </w:p>
+    <w:p>
+      <w:pPr>
+        <w:spacing w:after="0"/>
+        <w:rPr>
+          <w:sz w:val="16"/>
+          <w:szCs w:val="16"/>
+        </w:rPr>
+      </w:pPr>
+      <w:r>
+        <w:rPr>
+          <w:sz w:val="16"/>
+          <w:szCs w:val="16"/>
+        </w:rPr>
+        <w:t xml:space="preserve">   43  aws eks update-kubeconfig --region $us-east-1 --name $my-eks-cluster</w:t>
+      </w:r>
+    </w:p>
+    <w:p>
+      <w:pPr>
+        <w:spacing w:after="0"/>
+        <w:rPr>
+          <w:sz w:val="16"/>
+          <w:szCs w:val="16"/>
+        </w:rPr>
+      </w:pPr>
+      <w:r>
+        <w:rPr>
+          <w:sz w:val="16"/>
+          <w:szCs w:val="16"/>
+        </w:rPr>
+        <w:t xml:space="preserve">   44  aws eks update-kubeconfig --region us-east-1 --name my-eks-cluster</w:t>
+      </w:r>
+    </w:p>
+    <w:p>
+      <w:pPr>
+        <w:spacing w:after="0"/>
+        <w:rPr>
+          <w:sz w:val="16"/>
+          <w:szCs w:val="16"/>
+        </w:rPr>
+      </w:pPr>
+      <w:r>
+        <w:rPr>
+          <w:sz w:val="16"/>
+          <w:szCs w:val="16"/>
+        </w:rPr>
+        <w:t xml:space="preserve">   45  kubectl exec -it node-app-6c6897f77c-2mwvk -- /bin/bash</w:t>
+      </w:r>
+    </w:p>
+    <w:p>
+      <w:pPr>
+        <w:spacing w:after="0"/>
+        <w:rPr>
+          <w:sz w:val="16"/>
+          <w:szCs w:val="16"/>
+        </w:rPr>
+      </w:pPr>
+      <w:r>
+        <w:rPr>
+          <w:sz w:val="16"/>
+          <w:szCs w:val="16"/>
+        </w:rPr>
+        <w:t xml:space="preserve">   46  dnf install bash</w:t>
+      </w:r>
+    </w:p>
+    <w:p>
+      <w:pPr>
+        <w:spacing w:after="0"/>
+        <w:rPr>
+          <w:sz w:val="16"/>
+          <w:szCs w:val="16"/>
+        </w:rPr>
+      </w:pPr>
+      <w:r>
+        <w:rPr>
+          <w:sz w:val="16"/>
+          <w:szCs w:val="16"/>
+        </w:rPr>
+        <w:t xml:space="preserve">   47  kubectl exec -it node-app-6c6897f77c-2mwvk -- /bin/sh</w:t>
+      </w:r>
+    </w:p>
+    <w:p>
+      <w:pPr>
+        <w:spacing w:after="0"/>
+        <w:rPr>
+          <w:sz w:val="16"/>
+          <w:szCs w:val="16"/>
+        </w:rPr>
+      </w:pPr>
+      <w:r>
+        <w:rPr>
+          <w:sz w:val="16"/>
+          <w:szCs w:val="16"/>
+        </w:rPr>
+        <w:t xml:space="preserve">   48  kubectl get pods</w:t>
+      </w:r>
+    </w:p>
+    <w:p>
+      <w:pPr>
+        <w:spacing w:after="0"/>
+        <w:rPr>
+          <w:sz w:val="16"/>
+          <w:szCs w:val="16"/>
+        </w:rPr>
+      </w:pPr>
+      <w:r>
+        <w:rPr>
+          <w:sz w:val="16"/>
+          <w:szCs w:val="16"/>
+        </w:rPr>
+        <w:t xml:space="preserve">   49  kubectl get nodes</w:t>
+      </w:r>
+    </w:p>
+    <w:p>
+      <w:pPr>
+        <w:spacing w:after="0"/>
+        <w:rPr>
+          <w:sz w:val="16"/>
+          <w:szCs w:val="16"/>
+        </w:rPr>
+      </w:pPr>
+      <w:r>
+        <w:rPr>
+          <w:sz w:val="16"/>
+          <w:szCs w:val="16"/>
+        </w:rPr>
+        <w:t xml:space="preserve">   50  kubectl get cluster</w:t>
+      </w:r>
+    </w:p>
+    <w:p>
+      <w:pPr>
+        <w:spacing w:after="0"/>
+        <w:rPr>
+          <w:sz w:val="16"/>
+          <w:szCs w:val="16"/>
+        </w:rPr>
+      </w:pPr>
+      <w:r>
+        <w:rPr>
+          <w:sz w:val="16"/>
+          <w:szCs w:val="16"/>
+        </w:rPr>
+        <w:t xml:space="preserve">   51  eksctl get cluster</w:t>
+      </w:r>
+    </w:p>
+    <w:p>
+      <w:pPr>
+        <w:spacing w:after="0"/>
+        <w:rPr>
+          <w:sz w:val="16"/>
+          <w:szCs w:val="16"/>
+        </w:rPr>
+      </w:pPr>
+      <w:r>
+        <w:rPr>
+          <w:sz w:val="16"/>
+          <w:szCs w:val="16"/>
+        </w:rPr>
+        <w:t xml:space="preserve">   52  history</w:t>
       </w:r>
     </w:p>
     <w:p>

</xml_diff>